<commit_message>
Update site title and resume files; enhance hyperlink functionality in resume generation script
</commit_message>
<xml_diff>
--- a/assets/docs/David_Sillman_Resume.docx
+++ b/assets/docs/David_Sillman_Resume.docx
@@ -1661,17 +1661,19 @@
         </w:rPr>
         <w:t xml:space="preserve">•  </w:t>
       </w:r>
-      <w:r>
-        <w:rPr>
-          <w:rFonts w:ascii="Roboto Mono" w:hAnsi="Roboto Mono" w:cs="Roboto Mono"/>
-          <w:rFonts w:ascii="Roboto Mono" w:hAnsi="Roboto Mono"/>
-          <w:b/>
-          <w:i w:val="0"/>
-          <w:color w:val="2B6CB0"/>
-          <w:sz w:val="15"/>
-        </w:rPr>
-        <w:t>decision-tree-stuff</w:t>
-      </w:r>
+      <w:hyperlink r:id="rId12">
+        <w:r>
+          <w:rPr>
+            <w:rFonts w:ascii="Roboto Mono" w:hAnsi="Roboto Mono" w:cs="Roboto Mono"/>
+            <w:sz w:val="15"/>
+            <w:szCs w:val="15"/>
+            <w:color w:val="2B6CB0"/>
+            <w:b/>
+            <w:u w:val="none"/>
+          </w:rPr>
+          <w:t xml:space="preserve">decision-tree-stuff</w:t>
+        </w:r>
+      </w:hyperlink>
       <w:r>
         <w:rPr>
           <w:rFonts w:ascii="Inter" w:hAnsi="Inter" w:cs="Inter"/>
@@ -1700,17 +1702,19 @@
         </w:rPr>
         <w:t xml:space="preserve">•  </w:t>
       </w:r>
-      <w:r>
-        <w:rPr>
-          <w:rFonts w:ascii="Roboto Mono" w:hAnsi="Roboto Mono" w:cs="Roboto Mono"/>
-          <w:rFonts w:ascii="Roboto Mono" w:hAnsi="Roboto Mono"/>
-          <w:b/>
-          <w:i w:val="0"/>
-          <w:color w:val="2B6CB0"/>
-          <w:sz w:val="15"/>
-        </w:rPr>
-        <w:t>yaml-reference-*</w:t>
-      </w:r>
+      <w:hyperlink r:id="rId13">
+        <w:r>
+          <w:rPr>
+            <w:rFonts w:ascii="Roboto Mono" w:hAnsi="Roboto Mono" w:cs="Roboto Mono"/>
+            <w:sz w:val="15"/>
+            <w:szCs w:val="15"/>
+            <w:color w:val="2B6CB0"/>
+            <w:b/>
+            <w:u w:val="none"/>
+          </w:rPr>
+          <w:t xml:space="preserve">yaml-reference-*</w:t>
+        </w:r>
+      </w:hyperlink>
       <w:r>
         <w:rPr>
           <w:rFonts w:ascii="Inter" w:hAnsi="Inter" w:cs="Inter"/>

</xml_diff>

<commit_message>
fix: update resume generation script to include new roles and enhance formatting
</commit_message>
<xml_diff>
--- a/assets/docs/David_Sillman_Resume.docx
+++ b/assets/docs/David_Sillman_Resume.docx
@@ -579,7 +579,7 @@
     </w:p>
     <w:p>
       <w:pPr>
-        <w:spacing w:before="80" w:after="10"/>
+        <w:spacing w:before="80" w:after="15"/>
       </w:pPr>
       <w:r>
         <w:rPr>
@@ -617,7 +617,8 @@
     </w:p>
     <w:p>
       <w:pPr>
-        <w:spacing w:before="25" w:after="30"/>
+        <w:spacing w:before="20" w:after="0"/>
+        <w:ind w:left="288"/>
       </w:pPr>
       <w:r>
         <w:rPr>
@@ -650,8 +651,130 @@
           <w:color w:val="666666"/>
           <w:sz w:val="16"/>
         </w:rPr>
-        <w:t>July 2022 – Present</w:t>
+        <w:t>October 2025 – Present</w:t>
       </w:r>
+    </w:p>
+    <w:p>
+      <w:pPr>
+        <w:spacing w:before="0" w:after="0"/>
+        <w:ind w:left="288"/>
+      </w:pPr>
+      <w:r>
+        <w:rPr>
+          <w:rFonts w:ascii="Inter" w:hAnsi="Inter" w:cs="Inter"/>
+          <w:rFonts w:ascii="Inter" w:hAnsi="Inter"/>
+          <w:b/>
+          <w:i w:val="0"/>
+          <w:color w:val="2B6CB0"/>
+          <w:sz w:val="17"/>
+        </w:rPr>
+        <w:t>Data Engineer</w:t>
+      </w:r>
+      <w:r>
+        <w:rPr>
+          <w:rFonts w:ascii="Inter" w:hAnsi="Inter" w:cs="Inter"/>
+          <w:rFonts w:ascii="Inter" w:hAnsi="Inter"/>
+          <w:b w:val="0"/>
+          <w:i w:val="0"/>
+          <w:color w:val="666666"/>
+          <w:sz w:val="16"/>
+        </w:rPr>
+        <w:t xml:space="preserve">   |   </w:t>
+      </w:r>
+      <w:r>
+        <w:rPr>
+          <w:rFonts w:ascii="Inter" w:hAnsi="Inter" w:cs="Inter"/>
+          <w:rFonts w:ascii="Inter" w:hAnsi="Inter"/>
+          <w:b w:val="0"/>
+          <w:i/>
+          <w:color w:val="666666"/>
+          <w:sz w:val="16"/>
+        </w:rPr>
+        <w:t>March 2024 – September 2025</w:t>
+      </w:r>
+    </w:p>
+    <w:p>
+      <w:pPr>
+        <w:spacing w:before="0" w:after="0"/>
+        <w:ind w:left="288"/>
+      </w:pPr>
+      <w:r>
+        <w:rPr>
+          <w:rFonts w:ascii="Inter" w:hAnsi="Inter" w:cs="Inter"/>
+          <w:rFonts w:ascii="Inter" w:hAnsi="Inter"/>
+          <w:b/>
+          <w:i w:val="0"/>
+          <w:color w:val="2B6CB0"/>
+          <w:sz w:val="17"/>
+        </w:rPr>
+        <w:t>Advanced Data Analyst</w:t>
+      </w:r>
+      <w:r>
+        <w:rPr>
+          <w:rFonts w:ascii="Inter" w:hAnsi="Inter" w:cs="Inter"/>
+          <w:rFonts w:ascii="Inter" w:hAnsi="Inter"/>
+          <w:b w:val="0"/>
+          <w:i w:val="0"/>
+          <w:color w:val="666666"/>
+          <w:sz w:val="16"/>
+        </w:rPr>
+        <w:t xml:space="preserve">   |   </w:t>
+      </w:r>
+      <w:r>
+        <w:rPr>
+          <w:rFonts w:ascii="Inter" w:hAnsi="Inter" w:cs="Inter"/>
+          <w:rFonts w:ascii="Inter" w:hAnsi="Inter"/>
+          <w:b w:val="0"/>
+          <w:i/>
+          <w:color w:val="666666"/>
+          <w:sz w:val="16"/>
+        </w:rPr>
+        <w:t>July 2022 – February 2024</w:t>
+      </w:r>
+    </w:p>
+    <w:p>
+      <w:pPr>
+        <w:spacing w:before="0" w:after="0"/>
+        <w:ind w:left="288"/>
+      </w:pPr>
+      <w:r>
+        <w:rPr>
+          <w:rFonts w:ascii="Inter" w:hAnsi="Inter" w:cs="Inter"/>
+          <w:rFonts w:ascii="Inter" w:hAnsi="Inter"/>
+          <w:b/>
+          <w:i w:val="0"/>
+          <w:color w:val="2B6CB0"/>
+          <w:sz w:val="17"/>
+        </w:rPr>
+        <w:t>Data Science Intern</w:t>
+      </w:r>
+      <w:r>
+        <w:rPr>
+          <w:rFonts w:ascii="Inter" w:hAnsi="Inter" w:cs="Inter"/>
+          <w:rFonts w:ascii="Inter" w:hAnsi="Inter"/>
+          <w:b w:val="0"/>
+          <w:i w:val="0"/>
+          <w:color w:val="666666"/>
+          <w:sz w:val="16"/>
+        </w:rPr>
+        <w:t xml:space="preserve">   |   </w:t>
+      </w:r>
+      <w:r>
+        <w:rPr>
+          <w:rFonts w:ascii="Inter" w:hAnsi="Inter" w:cs="Inter"/>
+          <w:rFonts w:ascii="Inter" w:hAnsi="Inter"/>
+          <w:b w:val="0"/>
+          <w:i/>
+          <w:color w:val="666666"/>
+          <w:sz w:val="16"/>
+        </w:rPr>
+        <w:t>May 2020 – June 2022</w:t>
+      </w:r>
+    </w:p>
+    <w:p>
+      <w:pPr>
+        <w:spacing w:before="15" w:after="0"/>
+      </w:pPr>
     </w:p>
     <w:p>
       <w:pPr>
@@ -1324,55 +1447,6 @@
     </w:p>
     <w:p>
       <w:pPr>
-        <w:spacing w:before="65" w:after="30"/>
-      </w:pPr>
-      <w:r>
-        <w:rPr>
-          <w:rFonts w:ascii="Inter" w:hAnsi="Inter" w:cs="Inter"/>
-          <w:rFonts w:ascii="Inter" w:hAnsi="Inter"/>
-          <w:b/>
-          <w:i w:val="0"/>
-          <w:color w:val="2B6CB0"/>
-          <w:sz w:val="17"/>
-        </w:rPr>
-        <w:t>Advanced Data Analyst</w:t>
-      </w:r>
-      <w:r>
-        <w:rPr>
-          <w:rFonts w:ascii="Inter" w:hAnsi="Inter" w:cs="Inter"/>
-          <w:rFonts w:ascii="Inter" w:hAnsi="Inter"/>
-          <w:b w:val="0"/>
-          <w:i w:val="0"/>
-          <w:color w:val="666666"/>
-          <w:sz w:val="16"/>
-        </w:rPr>
-        <w:t xml:space="preserve">   |   </w:t>
-      </w:r>
-      <w:r>
-        <w:rPr>
-          <w:rFonts w:ascii="Inter" w:hAnsi="Inter" w:cs="Inter"/>
-          <w:rFonts w:ascii="Inter" w:hAnsi="Inter"/>
-          <w:b w:val="0"/>
-          <w:i/>
-          <w:color w:val="666666"/>
-          <w:sz w:val="16"/>
-        </w:rPr>
-        <w:t xml:space="preserve">July 2022 – March 2023  </w:t>
-      </w:r>
-      <w:r>
-        <w:rPr>
-          <w:rFonts w:ascii="Inter" w:hAnsi="Inter" w:cs="Inter"/>
-          <w:rFonts w:ascii="Inter" w:hAnsi="Inter"/>
-          <w:b w:val="0"/>
-          <w:i/>
-          <w:color w:val="666666"/>
-          <w:sz w:val="15"/>
-        </w:rPr>
-        <w:t>(concurrent)</w:t>
-      </w:r>
-    </w:p>
-    <w:p>
-      <w:pPr>
         <w:spacing w:before="0" w:after="40"/>
         <w:ind w:left="504" w:hanging="288"/>
       </w:pPr>
@@ -1391,12 +1465,23 @@
         <w:rPr>
           <w:rFonts w:ascii="Inter" w:hAnsi="Inter" w:cs="Inter"/>
           <w:rFonts w:ascii="Inter" w:hAnsi="Inter"/>
+          <w:b/>
+          <w:i w:val="0"/>
+          <w:color w:val="1A1A1A"/>
+          <w:sz w:val="16"/>
+        </w:rPr>
+        <w:t>Analyzed Clinical Data:</w:t>
+      </w:r>
+      <w:r>
+        <w:rPr>
+          <w:rFonts w:ascii="Inter" w:hAnsi="Inter" w:cs="Inter"/>
+          <w:rFonts w:ascii="Inter" w:hAnsi="Inter"/>
           <w:b w:val="0"/>
           <w:i w:val="0"/>
           <w:color w:val="1A1A1A"/>
           <w:sz w:val="16"/>
         </w:rPr>
-        <w:t xml:space="preserve">Analyzed clinical usage data for the Ion System with </w:t>
+        <w:t xml:space="preserve"> Parsed and organized Ion System usage data with </w:t>
       </w:r>
       <w:r>
         <w:rPr>
@@ -1462,35 +1547,7 @@
           <w:color w:val="1A1A1A"/>
           <w:sz w:val="16"/>
         </w:rPr>
-        <w:t>.</w:t>
-      </w:r>
-    </w:p>
-    <w:p>
-      <w:pPr>
-        <w:spacing w:before="0" w:after="40"/>
-        <w:ind w:left="504" w:hanging="288"/>
-      </w:pPr>
-      <w:r>
-        <w:rPr>
-          <w:rFonts w:ascii="Inter" w:hAnsi="Inter" w:cs="Inter"/>
-          <w:rFonts w:ascii="Inter" w:hAnsi="Inter"/>
-          <w:b w:val="0"/>
-          <w:i w:val="0"/>
-          <w:color w:val="1A1A1A"/>
-          <w:sz w:val="16"/>
-        </w:rPr>
-        <w:t xml:space="preserve">•  </w:t>
-      </w:r>
-      <w:r>
-        <w:rPr>
-          <w:rFonts w:ascii="Inter" w:hAnsi="Inter" w:cs="Inter"/>
-          <w:rFonts w:ascii="Inter" w:hAnsi="Inter"/>
-          <w:b w:val="0"/>
-          <w:i w:val="0"/>
-          <w:color w:val="1A1A1A"/>
-          <w:sz w:val="16"/>
-        </w:rPr>
-        <w:t xml:space="preserve">Built internal web apps: a </w:t>
+        <w:t xml:space="preserve">; built internal web apps including a </w:t>
       </w:r>
       <w:r>
         <w:rPr>
@@ -1512,29 +1569,7 @@
           <w:color w:val="1A1A1A"/>
           <w:sz w:val="16"/>
         </w:rPr>
-        <w:t xml:space="preserve"> visualization dashboard with </w:t>
-      </w:r>
-      <w:r>
-        <w:rPr>
-          <w:rFonts w:ascii="Inter" w:hAnsi="Inter" w:cs="Inter"/>
-          <w:rFonts w:ascii="Inter" w:hAnsi="Inter"/>
-          <w:b/>
-          <w:i w:val="0"/>
-          <w:color w:val="1A1A1A"/>
-          <w:sz w:val="16"/>
-        </w:rPr>
-        <w:t>Jinja</w:t>
-      </w:r>
-      <w:r>
-        <w:rPr>
-          <w:rFonts w:ascii="Inter" w:hAnsi="Inter" w:cs="Inter"/>
-          <w:rFonts w:ascii="Inter" w:hAnsi="Inter"/>
-          <w:b w:val="0"/>
-          <w:i w:val="0"/>
-          <w:color w:val="1A1A1A"/>
-          <w:sz w:val="16"/>
-        </w:rPr>
-        <w:t xml:space="preserve"> and a </w:t>
+        <w:t xml:space="preserve"> dashboard and a </w:t>
       </w:r>
       <w:r>
         <w:rPr>
@@ -1557,72 +1592,6 @@
           <w:sz w:val="16"/>
         </w:rPr>
         <w:t xml:space="preserve"> 3D geometry viewer.</w:t>
-      </w:r>
-    </w:p>
-    <w:p>
-      <w:pPr>
-        <w:spacing w:before="65" w:after="5"/>
-      </w:pPr>
-      <w:r>
-        <w:rPr>
-          <w:rFonts w:ascii="Inter" w:hAnsi="Inter" w:cs="Inter"/>
-          <w:rFonts w:ascii="Inter" w:hAnsi="Inter"/>
-          <w:b/>
-          <w:i w:val="0"/>
-          <w:color w:val="2B6CB0"/>
-          <w:sz w:val="17"/>
-        </w:rPr>
-        <w:t>Data Science Intern</w:t>
-      </w:r>
-      <w:r>
-        <w:rPr>
-          <w:rFonts w:ascii="Inter" w:hAnsi="Inter" w:cs="Inter"/>
-          <w:rFonts w:ascii="Inter" w:hAnsi="Inter"/>
-          <w:b w:val="0"/>
-          <w:i w:val="0"/>
-          <w:color w:val="666666"/>
-          <w:sz w:val="16"/>
-        </w:rPr>
-        <w:t xml:space="preserve">   |   </w:t>
-      </w:r>
-      <w:r>
-        <w:rPr>
-          <w:rFonts w:ascii="Inter" w:hAnsi="Inter" w:cs="Inter"/>
-          <w:rFonts w:ascii="Inter" w:hAnsi="Inter"/>
-          <w:b w:val="0"/>
-          <w:i/>
-          <w:color w:val="666666"/>
-          <w:sz w:val="16"/>
-        </w:rPr>
-        <w:t>May 2020 – April 2022</w:t>
-      </w:r>
-    </w:p>
-    <w:p>
-      <w:pPr>
-        <w:spacing w:before="0" w:after="40"/>
-        <w:ind w:left="504" w:hanging="288"/>
-      </w:pPr>
-      <w:r>
-        <w:rPr>
-          <w:rFonts w:ascii="Inter" w:hAnsi="Inter" w:cs="Inter"/>
-          <w:rFonts w:ascii="Inter" w:hAnsi="Inter"/>
-          <w:b w:val="0"/>
-          <w:i w:val="0"/>
-          <w:color w:val="1A1A1A"/>
-          <w:sz w:val="16"/>
-        </w:rPr>
-        <w:t xml:space="preserve">•  </w:t>
-      </w:r>
-      <w:r>
-        <w:rPr>
-          <w:rFonts w:ascii="Inter" w:hAnsi="Inter" w:cs="Inter"/>
-          <w:rFonts w:ascii="Inter" w:hAnsi="Inter"/>
-          <w:b w:val="0"/>
-          <w:i w:val="0"/>
-          <w:color w:val="1A1A1A"/>
-          <w:sz w:val="16"/>
-        </w:rPr>
-        <w:t>Analyzed clinical usage data, laying the groundwork for the pipelines and apps developed in subsequent roles.</w:t>
       </w:r>
     </w:p>
     <w:p>

</xml_diff>